<commit_message>
Corregir Capitulo 78: Ajustar escuadrones y misiones a la distribucion canonica aleatoria del Capitulo 64
</commit_message>
<xml_diff>
--- a/capitulos/78_Capitulo_78.docx
+++ b/capitulos/78_Capitulo_78.docx
@@ -52,7 +52,7 @@
           <w:color w:val="1C1C20"/>
           <w:sz w:val="22"/>
         </w:rPr>
-        <w:t>El fuego del hogar de *La Jarra Plateada* crepitaba con fuerza, proyectando sombras danzarinas sobre las vigas de roble y las jarras de estaño.</w:t>
+        <w:t>El fuego del hogar de *La Jarra Plateada* crepitaba con fuerza, proyectando destellos dorados y sombras alargadas sobre las vigas de roble y las jarras de peltre.</w:t>
       </w:r>
     </w:p>
     <w:p>
@@ -66,7 +66,7 @@
           <w:color w:val="1C1C20"/>
           <w:sz w:val="22"/>
         </w:rPr>
-        <w:t>A medida que la noche avanzaba y los relatos de Morvath dejaban paso al tintineo de los cubiertos, apoyé los codos sobre la mesa de la cabecera. Miré a cada uno de mis amigos con una media sonrisa retadora, cruzando miradas con Ken, Caesar, Subaru, Kaoruko y Erza:</w:t>
+        <w:t>A medida que la cena avanzaba y los oscuros relatos de Morvath dejaban paso al tintineo de los cubiertos, apoyé los codos sobre la mesa de la cabecera. Recorrí con la mirada a cada uno de mis hermanos de armas: Ken, Caesar, Subaru, Kaoruko, Lucy, Erza, Yami y los demás. Una media sonrisa retadora se dibujó en mis labios al dar un trago a mi cerveza:</w:t>
       </w:r>
     </w:p>
     <w:p>
@@ -80,7 +80,7 @@
           <w:color w:val="1C1C20"/>
           <w:sz w:val="22"/>
         </w:rPr>
-        <w:t>—Ya les contamos con lujo de detalles cómo Vlad, Akame y la Sección Uno le arrancamos las fauces al culto en el sur... —dije dando un trago a mi cerveza—. Pero no crean que se librarán de su parte. ¿Qué hicieron ustedes durante este mes mientras nosotros nos arrastrábamos por alcantarillas y fundiciones?</w:t>
+        <w:t>—Vlad, Akame y yo ya les contamos cómo la Sección Uno le arrancó las fauces a la herejía en el este... —dije con voz serena pero provocadora—. Pero la reforma del Instructor Gerald nos dispersó por todo el reino precisamente para que nadie se acomodara. Separaron a las parejas y nos mezclaron en secciones aleatorias para romper camarillas y probar si podíamos valernos por nosotros mismos. Así que no crean que se librarán de rendir cuentas. ¿Qué hicieron ustedes durante este mes mientras nosotros nos arrastrábamos por fundiciones y minas de cal viva?</w:t>
       </w:r>
     </w:p>
     <w:p>
@@ -94,7 +94,7 @@
           <w:color w:val="1C1C20"/>
           <w:sz w:val="22"/>
         </w:rPr>
-        <w:t>Ken fue el primero en reaccionar. El artista marcial golpeó la mesa con su jarra, haciendo temblar los platos entre carcajadas:</w:t>
+        <w:t>Ken fue el primero en responder. El artista marcial golpeó la mesa con su jarra, haciendo bailar los platos entre carcajadas:</w:t>
       </w:r>
     </w:p>
     <w:p>
@@ -108,7 +108,7 @@
           <w:color w:val="1C1C20"/>
           <w:sz w:val="22"/>
         </w:rPr>
-        <w:t>—¡Ja! ¡Nosotros no nos quedamos calentando asientos, hermano! ¡Nuestra misión en la Garganta de Fuego fue puro infierno!</w:t>
+        <w:t>—¡Ja! ¡Nosotros no nos quedamos rascándonos la panza, hermano! ¡Nuestra misión de la Sección Cuatro en la Garganta de Fuego fue puro infierno desde el primer día!</w:t>
       </w:r>
     </w:p>
     <w:p>
@@ -136,7 +136,7 @@
           <w:color w:val="1C1C20"/>
           <w:sz w:val="22"/>
         </w:rPr>
-        <w:t>Ken se acomodó la bandana roja en la frente y comenzó su relato con los ojos chispeantes de euforia marcial.</w:t>
+        <w:t>Ken se acomodó la bandana roja en la frente y comenzó su relato con los ojos chispeantes de ardor marcial.</w:t>
       </w:r>
     </w:p>
     <w:p>
@@ -150,7 +150,21 @@
           <w:color w:val="1C1C20"/>
           <w:sz w:val="22"/>
         </w:rPr>
-        <w:t>Había sido asignado a la vanguardia de las estribaciones volcánicas del este junto a un contingente mixto de las Clases B y C, bajo la supervisión remota de su maestra Hwa Young. Al principio, los cadetes aristócratas miraban con desdén a Ken por pelear a puño limpio sin escudo ni peto de acero, tratándolo como un campesino insensato.</w:t>
+        <w:t>La Sección Cuatro había sido conformada por una mezcla improbable: Ken, Lady Elysea de Vane, Piper Wheel y tres antiguos cadetes nobles de la vieja Clase A-1. Al inicio, aquellos aristócratas estirados miraban con abierto desdén a Ken por pelear a puño limpio sin coraza de acero, y trataban a Piper como a una 'mocosa callejera engrasada' por comer galletas sobre los mapas rúnicos mientras ajustaba sus llaves mecánicas.</w:t>
+      </w:r>
+    </w:p>
+    <w:p>
+      <w:pPr>
+        <w:spacing w:line="300" w:lineRule="auto" w:after="100"/>
+        <w:ind w:left="259"/>
+      </w:pPr>
+      <w:r>
+        <w:rPr>
+          <w:rFonts w:ascii="Georgia" w:hAnsi="Georgia"/>
+          <w:color w:val="1C1C20"/>
+          <w:sz w:val="22"/>
+        </w:rPr>
+        <w:t>—Lady Vane los puso en su sitio la primera noche —relató Ken entre risas—. Desenvainó su estoque gélido *Escarcha Silenciosa* y le congeló la copa de vino a uno en la mano a un milímetro de su nariz, advirtiéndoles que si volvían a faltarnos al respeto los dejaría pegados al suelo como estatuas de hielo.</w:t>
       </w:r>
     </w:p>
     <w:p>
@@ -164,7 +178,7 @@
           <w:color w:val="1C1C20"/>
           <w:sz w:val="22"/>
         </w:rPr>
-        <w:t>Todo cambió cuando un Drake de Magma Alfa —un reptil colosal de escamas de basalto y aliento ígneo de dos mil grados— emboscó a una caravana de refugiados mineros en un desfiladero angosto.</w:t>
+        <w:t>La verdadera prueba llegó en el desfiladero de basalto de la Garganta de Fuego. Una caravana de refugiados mineros fue emboscada por un Drake de Magma Alfa: una bestia colosal de escamas volcánicas que exhalaba llamaradas a más de dos mil grados. En aquel cañón asfixiante, las pesadas armaduras de placas de los nobles se convirtieron en hornos mortales que casi los cocinan vivos por la radiación térmica.</w:t>
       </w:r>
     </w:p>
     <w:p>
@@ -178,7 +192,7 @@
           <w:color w:val="1C1C20"/>
           <w:sz w:val="22"/>
         </w:rPr>
-        <w:t>—Los nobles con armaduras pesadas casi se cocinan vivos dentro de sus corazas por la radiación térmica —narraba Ken gesticulando con entusiasmo—. La bestia iba a calcinar las carretas con los niños. No tuve tiempo de esperar órdenes: activé el paso del Fénix, salté sobre las rocas incandescentes y me metí directo bajo la mandíbula del lagarto.</w:t>
+        <w:t>—No había tiempo de formar filas —continuó Ken levantándose un poco de su banco—. Activé el *Paso del Fénix*, salté sobre las rocas al rojo vivo y me metí bajo la mandíbula del reptil. Lady Elysea coordinó el ataque con una precisión aristocrática impecable: lanzó una estocada de escarcha concentrada directo a la placa pectoral de la bestia, enfriando el basalto candente en una milésima de segundo.</w:t>
       </w:r>
     </w:p>
     <w:p>
@@ -192,7 +206,7 @@
           <w:color w:val="1C1C20"/>
           <w:sz w:val="22"/>
         </w:rPr>
-        <w:t>Ken relató cómo desvió un coletazo con la palma y concentró toda su energía solar en un gancho ascendente demoledor: el impacto reventó las placas óseas de la bestia en una detonación de llamas doradas que la derribó al fondo del barranco. Al final de la expedición, los mismos nobles que se burlaban de él terminaron cargándole las provisiones en señal de respeto absoluto.</w:t>
+        <w:t>El brutal choque térmico fracturó la coraza de piedra. Fue en ese instante cuando Ken descargó su técnica marcial: un gancho ascendente imbuido en fuego solar puro que penetró la grieta, pulverizando la quijada del Drake y arrojándolo al fondo del abismo en una llamarada dorada. Mientras tanto, Piper Wheel reparó sobre la marcha un cabrestante averiado con su motor de vapor de alta presión, arrastrando las carretas con los niños fuera del alcance de los derrumbes.</w:t>
       </w:r>
     </w:p>
     <w:p>
@@ -206,7 +220,21 @@
           <w:color w:val="1C1C20"/>
           <w:sz w:val="22"/>
         </w:rPr>
-        <w:t>—¡Un golpe limpio y seco! —celebró Borgar chocando su jarra con la de Ken—. ¡A los dragones se les parte la quijada de abajo hacia arriba, muchacho! ¡Bien hecho!</w:t>
+        <w:t>—Al final de la misión —concluyó Ken sonriendo de oreja a oreja—, los mismos nobles que se burlaban de nosotros terminaron cargándome la mochila y sirviéndole el té a Piper con la cabeza gacha. ¡Respeto ganado a golpe limpio!</w:t>
+      </w:r>
+    </w:p>
+    <w:p>
+      <w:pPr>
+        <w:spacing w:line="300" w:lineRule="auto" w:after="100"/>
+        <w:ind w:left="259"/>
+      </w:pPr>
+      <w:r>
+        <w:rPr>
+          <w:rFonts w:ascii="Georgia" w:hAnsi="Georgia"/>
+          <w:color w:val="1C1C20"/>
+          <w:sz w:val="22"/>
+        </w:rPr>
+        <w:t>—¡Así se habla, muchacho! —celebró Borgar chocando ruidosamente su jarra con la de Ken—. ¡A las alimañas de roca se les quiebra el espinazo combinando calor y frío! ¡Una técnica digna de un enano!</w:t>
       </w:r>
     </w:p>
     <w:p>
@@ -234,7 +262,7 @@
           <w:color w:val="1C1C20"/>
           <w:sz w:val="22"/>
         </w:rPr>
-        <w:t>A mi lado, Kaoruko sonrió con timidez, acariciando el dorso de mi mano antes de tomar la palabra animada por Yami.</w:t>
+        <w:t>Caesar King soltó una carcajada vibrante, mostrando una mella fresca en el borde de su gigantesco escudo de titanio:</w:t>
       </w:r>
     </w:p>
     <w:p>
@@ -248,7 +276,7 @@
           <w:color w:val="1C1C20"/>
           <w:sz w:val="22"/>
         </w:rPr>
-        <w:t>—A nosotras nos tocó una misión muy distinta, pero igual de peligrosa —explicó Kaoruko con su voz dulce y templada—. Lady Vane y yo fuimos asignadas a la protección logística del Valle de los Lirios, custodiando un convoy de semillas, boticarios y trigo para los pueblos del este.</w:t>
+        <w:t>—¡Pues la Sección Cinco no se quedó atrás en acción bruta! Aunque admito que me tocó hacer de niñera de dos bichos raros: este estratega de aura plateada y una científica que casi nos desintegra el campamento.</w:t>
       </w:r>
     </w:p>
     <w:p>
@@ -262,7 +290,7 @@
           <w:color w:val="1C1C20"/>
           <w:sz w:val="22"/>
         </w:rPr>
-        <w:t>En mitad de los bosques templados, una banda de cuarenta desertores mercenarios intentó asaltar las carretas para apoderarse de los suministros medicinales.</w:t>
+        <w:t>Subaru Natsuki, sentado frente a Caesar, suspiró teatralmente mientras se frotaba los hombros con una mueca de dolor cómico:</w:t>
       </w:r>
     </w:p>
     <w:p>
@@ -276,7 +304,7 @@
           <w:color w:val="1C1C20"/>
           <w:sz w:val="22"/>
         </w:rPr>
-        <w:t>—Eran hombres violentos y desesperados —continuó Kaoruko—. Pero no queríamos provocar una carnicería. Cuando cargaron a caballo, levanté una barrera sagrada entrelazada con raíces de tierra que desarmó a los jinetes al atrapar las cinchas sin lastimar a los animales. Luego, Lady Vane avanzó con su estoque de escarcha:</w:t>
+        <w:t>—¡Sobrevivir a la Sección Cinco fue una hazaña peor que derrotar al culto! Caesar me despertaba a las cinco de la mañana a base de patadas para hacer trescientas flexiones en el barro diciendo que 'mi chasis necesitaba temple'. ¡Y mientras tanto, Agnes Tachyon no paraba de mezclar matraces humeantes que olían a azufre y maná inestable junto a mi bolsa de dormir!</w:t>
       </w:r>
     </w:p>
     <w:p>
@@ -290,7 +318,7 @@
           <w:color w:val="1C1C20"/>
           <w:sz w:val="22"/>
         </w:rPr>
-        <w:t>La dama aristocrática, con su porte gélido y letal, congeló los aceros y las empuñaduras de los bandidos al mero contacto, inutilizando sus armas antes de que pudieran derramar una sola gota de sangre. Capturaron a la banda completa y entregaron el cargamento intacto, recibiendo coronas de flores y bendiciones de los ancianos del valle.</w:t>
+        <w:t>La Sección Cinco había sido enviada al Paso del Trueno y los valles mineros septentrionales, plagados de nidos de mantícoras de tormenta que cazaban a los mineros imperiales. Subaru tomó las riendas tácticas del despliegue: en lugar de cargar a ciegas por los riscos, diseñó un sistema de silbatos de alta frecuencia y bengalas de fósforo para saturar los sentidos de las bestias y forzarlas a canalizarse por un desfiladero estrecho donde no pudieran desplegar las alas.</w:t>
       </w:r>
     </w:p>
     <w:p>
@@ -304,7 +332,63 @@
           <w:color w:val="1C1C20"/>
           <w:sz w:val="22"/>
         </w:rPr>
-        <w:t>—Control perfecto del maná —asintió Vlad con admiración—. Neutralizar sin masacrar requiere diez veces más destreza que aniquilar.</w:t>
+        <w:t>—Y ahí fue donde entró la capitana —añadió Subaru con sincera admiración—. Caesar se plantó en la boca del cañón como una cordillera viva. Aguantó la embestida de la mantícora alfa —un monstruo de cuatro toneladas cayendo en picada— con una risotada salvaje y un golpe de escudo que le partió las costillas en el aire.</w:t>
+      </w:r>
+    </w:p>
+    <w:p>
+      <w:pPr>
+        <w:spacing w:line="300" w:lineRule="auto" w:after="100"/>
+        <w:ind w:firstLine="403"/>
+      </w:pPr>
+      <w:r>
+        <w:rPr>
+          <w:rFonts w:ascii="Georgia" w:hAnsi="Georgia"/>
+          <w:color w:val="1C1C20"/>
+          <w:sz w:val="22"/>
+        </w:rPr>
+        <w:t>El golpe de gracia lo dio Agnes Tachyon: arrojó sus nuevos frascos de reactivos termodinámicos inestables al centro de la manada, desatando una explosión sónica de frío hiperbárico que congeló las alas de las bestias restantes, rindiéndolas sin necesidad de derramar más sangre.</w:t>
+      </w:r>
+    </w:p>
+    <w:p>
+      <w:pPr>
+        <w:spacing w:line="300" w:lineRule="auto" w:after="100"/>
+        <w:ind w:left="259"/>
+      </w:pPr>
+      <w:r>
+        <w:rPr>
+          <w:rFonts w:ascii="Georgia" w:hAnsi="Georgia"/>
+          <w:color w:val="1C1C20"/>
+          <w:sz w:val="22"/>
+        </w:rPr>
+        <w:t>—¡Buen cerebro y agallas de titanio! —rugió Caesar dándole a Subaru una palmada en la espalda que casi lo hace escupir la cerveza—. ¡Tienes madera de líder, novato!</w:t>
+      </w:r>
+    </w:p>
+    <w:p>
+      <w:pPr>
+        <w:spacing w:line="300" w:lineRule="auto" w:after="100"/>
+        <w:ind w:firstLine="403"/>
+      </w:pPr>
+      <w:r>
+        <w:rPr>
+          <w:rFonts w:ascii="Georgia" w:hAnsi="Georgia"/>
+          <w:color w:val="1C1C20"/>
+          <w:sz w:val="22"/>
+        </w:rPr>
+        <w:t>Desde el otro lado de la mesa, Lucy (que había estado en la Sección Dos) fingió desdén cruzándose de brazos, pero sus mejillas sonrojadas y sus ojos dorados no pudieron ocultar el alivio y el orgullo al ver a Subaru sano y salvo:</w:t>
+      </w:r>
+    </w:p>
+    <w:p>
+      <w:pPr>
+        <w:spacing w:line="300" w:lineRule="auto" w:after="100"/>
+        <w:ind w:left="259"/>
+      </w:pPr>
+      <w:r>
+        <w:rPr>
+          <w:rFonts w:ascii="Georgia" w:hAnsi="Georgia"/>
+          <w:color w:val="1C1C20"/>
+          <w:sz w:val="22"/>
+        </w:rPr>
+        <w:t>—Más te valía no hacerte matar por los frascos de Agnes, idiota... —murmuró la rubia con un mohín tierno que provocó sonrisas en toda la mesa.</w:t>
       </w:r>
     </w:p>
     <w:p>
@@ -332,7 +416,7 @@
           <w:color w:val="1C1C20"/>
           <w:sz w:val="22"/>
         </w:rPr>
-        <w:t>Caesar King soltó una carcajada estruendosa, mostrando una mella reciente en el borde de su gran escudo blindado:</w:t>
+        <w:t>A mi lado, Kaoruko Waguri sonrió con serenidad, rozando el dorso de mi mano con sus dedos cálidos antes de tomar la palabra animada por la mirada atenta del grupo.</w:t>
       </w:r>
     </w:p>
     <w:p>
@@ -346,7 +430,7 @@
           <w:color w:val="1C1C20"/>
           <w:sz w:val="22"/>
         </w:rPr>
-        <w:t>—¡Nosotros no tuvimos tanta delicadeza, te lo aseguro, Vlad! ¡El Paso del Trueno estaba infestado de Mantícoras y Guivernos rabiosos!</w:t>
+        <w:t>—A la Sección Seis nos asignaron una tarea muy distinta, pero que tocó profundamente nuestros corazones —explicó con su voz suave y melodiosa—. Yami, Lighter y yo fuimos enviados a custodiar la ruta médica del Valle de los Lirios, protegiendo un convoy con semillas, sanadores y trigo para las aldeas periféricas.</w:t>
       </w:r>
     </w:p>
     <w:p>
@@ -360,7 +444,7 @@
           <w:color w:val="1C1C20"/>
           <w:sz w:val="22"/>
         </w:rPr>
-        <w:t>Yami, recostada con elegancia sobre el respaldo de su silla, tomó el relevo con una sonrisa socarrona:</w:t>
+        <w:t>En mitad de los bosques templados, una banda de más de cincuenta mercenarios desertores intentó tender una emboscada para saquear los cargamentos medicinales.</w:t>
       </w:r>
     </w:p>
     <w:p>
@@ -374,7 +458,7 @@
           <w:color w:val="1C1C20"/>
           <w:sz w:val="22"/>
         </w:rPr>
-        <w:t>—Caesar hacía de cebo viviente. Se plantaba en mitad del peñasco, rugía más fuerte que los monstruos y aguantaba las embestidas aéreas con su escudo de asedio como si fuera una muralla de hierro. En cuanto la mantícora quedaba clavada en sus defensas, yo caía desde los riscos a sus espaldas.</w:t>
+        <w:t>—Yami dormía en el techo del carro con el puro encendido diciendo que su sola presencia espantaba a las moscas —relató Kaoruko con gracia contenida—. Pero cuando los jinetes cargaron disparando ballestas, Lighter saltó al frente como un rayo: sus puñetazos de combustión rápida desarmaron a los exploradores a una velocidad inverosímil, noqueándolos sin causarles heridas fatales.</w:t>
       </w:r>
     </w:p>
     <w:p>
@@ -388,7 +472,7 @@
           <w:color w:val="1C1C20"/>
           <w:sz w:val="22"/>
         </w:rPr>
-        <w:t>Yami narró cómo deslizaba sus dagas dobles imbuidas en miasma sombrío, cortando las alas membranosas en pleno vuelo y decapitando a las bestias antes de que pudieran clavar sus aguijones venenosos. La cacería fue tan aplastante que concluyeron el contrato tres días antes de lo previsto, bajando la carne de los monstruos al pueblo más cercano para armar un asado comunal con cerveza de montaña.</w:t>
+        <w:t>Cuando el grueso de los asaltantes cargó a caballo, Kaoruko intervino con maestría: desplegó una inmensa barrera sagrada entrelazada con zarzas y raíces florales de maná. La cúpula detuvo la lluvia de saetas en seco y las enredaderas atraparon suavemente las cinchas y las patas de las monturas, desarmando a la tropa completa sin herir a los animales ni quitar una sola vida humana.</w:t>
       </w:r>
     </w:p>
     <w:p>
@@ -402,7 +486,35 @@
           <w:color w:val="1C1C20"/>
           <w:sz w:val="22"/>
         </w:rPr>
-        <w:t>—Pura adrenalina de trinchera —comentó Vance con los ojos brillantes, maravillado por la sincronía entre el escudo de Caesar y las sombras de Yami.</w:t>
+        <w:t>—Y cuando el líder de la banda sacó un orbe explosivo oscuro para volar el convoy —añadió Kaoruko mirando de reojo al espadachín de las sombras—, Yami apareció tras él en un parpadeo de miasma y le apoyó la vaina de su katana en la nuca. Le bastó una mirada para que el hombre se desmayara del puro terror.</w:t>
+      </w:r>
+    </w:p>
+    <w:p>
+      <w:pPr>
+        <w:spacing w:line="300" w:lineRule="auto" w:after="100"/>
+        <w:ind w:firstLine="403"/>
+      </w:pPr>
+      <w:r>
+        <w:rPr>
+          <w:rFonts w:ascii="Georgia" w:hAnsi="Georgia"/>
+          <w:color w:val="1C1C20"/>
+          <w:sz w:val="22"/>
+        </w:rPr>
+        <w:t>Kaoruko no solo salvó la caravana, sino que pasó semanas curando a los campesinos enfermos de las aldeas y compartiendo panes de miel recién horneados, recibiendo coronas de lirios blancos de los ancianos agradecidos.</w:t>
+      </w:r>
+    </w:p>
+    <w:p>
+      <w:pPr>
+        <w:spacing w:line="300" w:lineRule="auto" w:after="100"/>
+        <w:ind w:firstLine="403"/>
+      </w:pPr>
+      <w:r>
+        <w:rPr>
+          <w:rFonts w:ascii="Georgia" w:hAnsi="Georgia"/>
+          <w:color w:val="1C1C20"/>
+          <w:sz w:val="22"/>
+        </w:rPr>
+        <w:t>Apreté suavemente la mano de Kaoruko bajo la mesa, mirándola a los ojos con devoción y orgullo sincero. Ella bajó la vista con un dulce sonrojo, apretando mis dedos en correspondencia.</w:t>
       </w:r>
     </w:p>
     <w:p>
@@ -430,7 +542,7 @@
           <w:color w:val="1C1C20"/>
           <w:sz w:val="22"/>
         </w:rPr>
-        <w:t>Natsuki Subaru se puso de pie de un salto, apoyando un pie en su banco con su clásica pose heroica y dramática:</w:t>
+        <w:t>Erza Scarlet fue la siguiente en tomar la palabra, imponiendo con su mera presencia la disciplina marcial que la caracterizaba como líder de la Sección Dos.</w:t>
       </w:r>
     </w:p>
     <w:p>
@@ -444,7 +556,7 @@
           <w:color w:val="1C1C20"/>
           <w:sz w:val="22"/>
         </w:rPr>
-        <w:t>—¡Y no olviden la gesta de los Pantanos de Niebla-Negra! ¡Una odisea de lodo, veneno y gloria táctica!</w:t>
+        <w:t>—Nuestra asignación nos llevó a los Pantanos de Niebla-Negra y las Ruinas Anegadas del norte —explicó Erza con tono solemne—. Dante Vance, Lucy y yo tuvimos que rastrear una infestación de acechadores de ciénaga y rezagados Skavens que habían atrapado a una patrulla de exploradores de tercer año en arenas movedizas.</w:t>
       </w:r>
     </w:p>
     <w:p>
@@ -458,7 +570,7 @@
           <w:color w:val="1C1C20"/>
           <w:sz w:val="22"/>
         </w:rPr>
-        <w:t>Lucy, sentada a su lado, resopló divertida tapándose el rostro con una mano:</w:t>
+        <w:t>Lucy resopló divertida, haciendo girar un tenedor entre sus dedos:</w:t>
       </w:r>
     </w:p>
     <w:p>
@@ -472,7 +584,21 @@
           <w:color w:val="1C1C20"/>
           <w:sz w:val="22"/>
         </w:rPr>
-        <w:t>—No exageres tanto, Subaru... aunque admito que fue un desastre al principio.</w:t>
+        <w:t>—Erza casi nos mata de agotamiento antes de llegar al pantano. Marchas forzadas de treinta kilómetros diarios en lodo hasta las rodillas desde las cuatro de la mañana, y cada vez que yo suspiraba pensando en la academia, ¡me caía una reprimenda por falta de concentración militar!</w:t>
+      </w:r>
+    </w:p>
+    <w:p>
+      <w:pPr>
+        <w:spacing w:line="300" w:lineRule="auto" w:after="100"/>
+        <w:ind w:left="259"/>
+      </w:pPr>
+      <w:r>
+        <w:rPr>
+          <w:rFonts w:ascii="Georgia" w:hAnsi="Georgia"/>
+          <w:color w:val="1C1C20"/>
+          <w:sz w:val="22"/>
+        </w:rPr>
+        <w:t>—La disciplina salva vidas en el terreno, Lucy —replicó Erza con severidad afectuosa—. Y demostraste con creces el temple de una verdadera guerrera.</w:t>
       </w:r>
     </w:p>
     <w:p>
@@ -486,7 +612,7 @@
           <w:color w:val="1C1C20"/>
           <w:sz w:val="22"/>
         </w:rPr>
-        <w:t>Subaru explicó cómo su grupo fue enviado a rastrear ciénagas brumosas infestadas de alimañas Skavens y acechadores del fango, donde una patrulla de exploradores de tercer año había quedado atrapada en arenas movedizas. Mientras Lucy utilizaba sus dagas gemelas para eliminar con destreza letal a los hostigadores en la niebla, Piper Wheel modificó el motor a vapor de una carreta cisterna, colocándole orugas flotantes de madera.</w:t>
+        <w:t>Erza narró cómo Dante Vance neutralizó centinelas a cuatrocientos metros entre la bruma con su mosquete rúnico, mientras Lucy ejecutaba piruetas acrobáticas letales con sus dagas dobles y patadas ígneas para cortar las sogas de los prisioneros antes de que fueran sumergidos. Cuando una Hidra del Cieno emergió del lodo profundo, Erza invocó su *Armadura de la Emperatriz del Agua* para congelar y estabilizar el terreno pantanoso, cambiando en un destello de luz a su *Armadura de la Rueda del Cielo* para decapitar a la criatura con una danza de espadas flotantes.</w:t>
       </w:r>
     </w:p>
     <w:p>
@@ -500,21 +626,7 @@
           <w:color w:val="1C1C20"/>
           <w:sz w:val="22"/>
         </w:rPr>
-        <w:t>—¡Subaru usó bombas de fósforo y silbatos señuelo para confundir a los monstruos en los juncos! —reveló Lucy mirando a su compañero con orgullo—. Nos abrió una ruta limpia y logramos sacar a los seis cadetes heridos antes de que se hundieran en el pantano.</w:t>
-      </w:r>
-    </w:p>
-    <w:p>
-      <w:pPr>
-        <w:spacing w:line="300" w:lineRule="auto" w:after="100"/>
-        <w:ind w:left="259"/>
-      </w:pPr>
-      <w:r>
-        <w:rPr>
-          <w:rFonts w:ascii="Georgia" w:hAnsi="Georgia"/>
-          <w:color w:val="1C1C20"/>
-          <w:sz w:val="22"/>
-        </w:rPr>
-        <w:t>—El cerebro también es un arma, amigos míos —bromeó Subaru hinchando el pecho, provocando risas y aplausos de toda la mesa.</w:t>
+        <w:t>—Misión cumplida con cero bajas y los cadetes rescatados intactos —concluyó Erza, dedicándole a Lucy una sonrisa de genuina aprobación marcial que hizo resplandecer a la rubia de los Calydon.</w:t>
       </w:r>
     </w:p>
     <w:p>
@@ -542,7 +654,7 @@
           <w:color w:val="1C1C20"/>
           <w:sz w:val="22"/>
         </w:rPr>
-        <w:t>Erza Scarlet fue la última en compartir su informe, haciéndolo con la sobriedad marcial que la caracterizaba.</w:t>
+        <w:t>Los ecos de las otras secciones también resonaron en la mesa: Rukia y Burnice en la Sección Tres, donde el hielo sagrado de la shinigami y los cócteles chispeantes de pimienta de la rubia calmaron tensiones en los valles rúnicos con el sigilo felino de Pulchra y el ojo certero de Hoshina; y la Sección Siete, donde Renji Abarai desató a *Zabimaru* contra golems de roca mientras Lortelle Kecheln aseguraba lucrativos acuerdos mercantiles de abastecimiento con los gremios mineros locales, respaldada por la firmeza de Freya y Zemina.</w:t>
       </w:r>
     </w:p>
     <w:p>
@@ -556,7 +668,49 @@
           <w:color w:val="1C1C20"/>
           <w:sz w:val="22"/>
         </w:rPr>
-        <w:t>Había sido desplegada en las Colinas Plateadas junto a Agnes Tachyon para investigar una perturbación arcana en una cripta subterránea del Imperio Antiguo. El lugar estaba custodiado por autómatas de granito y mithril reactivados por una sobrecarga de maná puro.</w:t>
+        <w:t>Cuando el último relato se apagó en la taberna, una atmósfera de profunda admiración y camaradería envolvió la mesa.</w:t>
+      </w:r>
+    </w:p>
+    <w:p>
+      <w:pPr>
+        <w:spacing w:line="300" w:lineRule="auto" w:after="100"/>
+        <w:ind w:firstLine="403"/>
+      </w:pPr>
+      <w:r>
+        <w:rPr>
+          <w:rFonts w:ascii="Georgia" w:hAnsi="Georgia"/>
+          <w:color w:val="1C1C20"/>
+          <w:sz w:val="22"/>
+        </w:rPr>
+        <w:t>Miré a cada uno de ellos. Ken con sus nudillos ardientes; Caesar y Subaru sonriendo con complicidad táctica; Kaoruko y Lucy reflejando fortaleza y ternura; Erza y Vlad como pilares de acero; Yami disfrutando de su cerveza en paz. Ninguno era el mismo cadete novato e impulsivo que había comenzado el semestre.</w:t>
+      </w:r>
+    </w:p>
+    <w:p>
+      <w:pPr>
+        <w:spacing w:line="300" w:lineRule="auto" w:after="100"/>
+        <w:ind w:firstLine="403"/>
+      </w:pPr>
+      <w:r>
+        <w:rPr>
+          <w:rFonts w:ascii="Georgia" w:hAnsi="Georgia"/>
+          <w:color w:val="1C1C20"/>
+          <w:sz w:val="22"/>
+        </w:rPr>
+        <w:t>Teníamos diecisiete años. Habíamos sido separados deliberadamente para que aprendiéramos a luchar sin nuestras muletas afectivas, enfrentando monstruos, hambre, bandidos y tormentas con compañeros desconocidos. Y el resultado era incuestionable: la vieja división entre clases y estamentos se había disuelto para siempre en el crisol de la experiencia real.</w:t>
+      </w:r>
+    </w:p>
+    <w:p>
+      <w:pPr>
+        <w:spacing w:line="300" w:lineRule="auto" w:after="100"/>
+        <w:ind w:firstLine="403"/>
+      </w:pPr>
+      <w:r>
+        <w:rPr>
+          <w:rFonts w:ascii="Georgia" w:hAnsi="Georgia"/>
+          <w:color w:val="1C1C20"/>
+          <w:sz w:val="22"/>
+        </w:rPr>
+        <w:t>Alcé mi jarra rebosante hacia el centro de la mesa. Todos respondieron al unísono, haciendo chocar el metal con un estruendo formidable que retumbó en las vigas del local:</w:t>
       </w:r>
     </w:p>
     <w:p>
@@ -570,7 +724,21 @@
           <w:color w:val="1C1C20"/>
           <w:sz w:val="22"/>
         </w:rPr>
-        <w:t>—Los constructos eran resistentes al daño cortante convencional —explicó Erza con mirada serena—. Tuve que recurrir a la Armadura de la Rueda del Cielo para contener a diez golems a la vez con espadas flotantes en círculos defensivos, mientras Agnes analizaba los circuitos rúnicos.</w:t>
+        <w:t>—Nos separaron creyendo que dependeríamos de nuestras parejas o de nuestras antiguas aulas —dije con voz firme y llena de convicción—. Y lo único que lograron fue convertir a cada uno de ustedes en una fuerza imparable.</w:t>
+      </w:r>
+    </w:p>
+    <w:p>
+      <w:pPr>
+        <w:spacing w:line="300" w:lineRule="auto" w:after="100"/>
+        <w:ind w:left="259"/>
+      </w:pPr>
+      <w:r>
+        <w:rPr>
+          <w:rFonts w:ascii="Georgia" w:hAnsi="Georgia"/>
+          <w:color w:val="1C1C20"/>
+          <w:sz w:val="22"/>
+        </w:rPr>
+        <w:t>—¡POR LA HERMANDAD DE LA F-2 Y LA GENERACIÓN DORADA! —rugió Ken alzando su puño envuelto en chispas solares.</w:t>
       </w:r>
     </w:p>
     <w:p>
@@ -584,147 +752,7 @@
           <w:color w:val="1C1C20"/>
           <w:sz w:val="22"/>
         </w:rPr>
-        <w:t>Agnes se acomodó los anteojos con suficiencia intelectual:</w:t>
-      </w:r>
-    </w:p>
-    <w:p>
-      <w:pPr>
-        <w:spacing w:line="300" w:lineRule="auto" w:after="100"/>
-        <w:ind w:left="259"/>
-      </w:pPr>
-      <w:r>
-        <w:rPr>
-          <w:rFonts w:ascii="Georgia" w:hAnsi="Georgia"/>
-          <w:color w:val="1C1C20"/>
-          <w:sz w:val="22"/>
-        </w:rPr>
-        <w:t>—Eran matrices de control de la Tercera Dinastía. Fascinantes. Logré revertir la polaridad de los cristales de alimentación en menos de veinte minutos, neutralizando los núcleos sin destruir las reliquias históricas. Un éxito académico total.</w:t>
-      </w:r>
-    </w:p>
-    <w:p>
-      <w:pPr>
-        <w:spacing w:before="280" w:after="280"/>
-        <w:jc w:val="center"/>
-      </w:pPr>
-      <w:r>
-        <w:rPr>
-          <w:rFonts w:ascii="Georgia" w:hAnsi="Georgia"/>
-          <w:color w:val="A082B4"/>
-          <w:sz w:val="22"/>
-        </w:rPr>
-        <w:t>✦   ✦   ✦</w:t>
-      </w:r>
-    </w:p>
-    <w:p>
-      <w:pPr>
-        <w:spacing w:line="300" w:lineRule="auto" w:after="100"/>
-        <w:ind w:firstLine="403"/>
-      </w:pPr>
-      <w:r>
-        <w:rPr>
-          <w:rFonts w:ascii="Georgia" w:hAnsi="Georgia"/>
-          <w:color w:val="1C1C20"/>
-          <w:sz w:val="22"/>
-        </w:rPr>
-        <w:t>Cuando el último relato terminó, el salón quedó envuelto en un silencio cálido y reverente.</w:t>
-      </w:r>
-    </w:p>
-    <w:p>
-      <w:pPr>
-        <w:spacing w:line="300" w:lineRule="auto" w:after="100"/>
-        <w:ind w:firstLine="403"/>
-      </w:pPr>
-      <w:r>
-        <w:rPr>
-          <w:rFonts w:ascii="Georgia" w:hAnsi="Georgia"/>
-          <w:color w:val="1C1C20"/>
-          <w:sz w:val="22"/>
-        </w:rPr>
-        <w:t>Miré a cada uno de los rostros congregados alrededor de las jarras vacías. Ken con sus nudillos humeantes; Kaoruko y Lucy con sus sonrisas llenas de ternura y templanza; Yami y Caesar con su lealtad forjada en fuego; Vlad y Vance representando la verdadera nobleza de espada; Subaru, Erza, Agnes y nuestros nuevos hermanos de Morvath.</w:t>
-      </w:r>
-    </w:p>
-    <w:p>
-      <w:pPr>
-        <w:spacing w:line="300" w:lineRule="auto" w:after="100"/>
-        <w:ind w:firstLine="403"/>
-      </w:pPr>
-      <w:r>
-        <w:rPr>
-          <w:rFonts w:ascii="Georgia" w:hAnsi="Georgia"/>
-          <w:color w:val="1C1C20"/>
-          <w:sz w:val="22"/>
-        </w:rPr>
-        <w:t>Ninguno de nosotros era el mismo novato inexperto que había cruzado las puertas de la Academia meses atrás.</w:t>
-      </w:r>
-    </w:p>
-    <w:p>
-      <w:pPr>
-        <w:spacing w:line="300" w:lineRule="auto" w:after="100"/>
-        <w:ind w:firstLine="403"/>
-      </w:pPr>
-      <w:r>
-        <w:rPr>
-          <w:rFonts w:ascii="Georgia" w:hAnsi="Georgia"/>
-          <w:color w:val="1C1C20"/>
-          <w:sz w:val="22"/>
-        </w:rPr>
-        <w:t>Teníamos diecisiete años recién cumplidos. Habíamos derramado sangre, salvado campesinos, derrotado herejías y desafiado a la muerte en los cuatro puntos cardinales del reino. La vieja discriminación entre nobles y plebeyos, entre la Clase A y la F, se había pulverizado por completo bajo el peso de nuestros actos.</w:t>
-      </w:r>
-    </w:p>
-    <w:p>
-      <w:pPr>
-        <w:spacing w:line="300" w:lineRule="auto" w:after="100"/>
-        <w:ind w:firstLine="403"/>
-      </w:pPr>
-      <w:r>
-        <w:rPr>
-          <w:rFonts w:ascii="Georgia" w:hAnsi="Georgia"/>
-          <w:color w:val="1C1C20"/>
-          <w:sz w:val="22"/>
-        </w:rPr>
-        <w:t>Alcé mi jarra rebosante hacia el centro de la mesa. Todos siguieron el gesto de inmediato, haciendo chocar el metal con un estruendo formidable que retumbó en la taberna:</w:t>
-      </w:r>
-    </w:p>
-    <w:p>
-      <w:pPr>
-        <w:spacing w:line="300" w:lineRule="auto" w:after="100"/>
-        <w:ind w:left="259"/>
-      </w:pPr>
-      <w:r>
-        <w:rPr>
-          <w:rFonts w:ascii="Georgia" w:hAnsi="Georgia"/>
-          <w:color w:val="1C1C20"/>
-          <w:sz w:val="22"/>
-        </w:rPr>
-        <w:t>—La academia quería probarnos enviándonos a los confines del mapa —dije con voz firme y profunda—. Y lo único que lograron fue hacernos más fuertes.</w:t>
-      </w:r>
-    </w:p>
-    <w:p>
-      <w:pPr>
-        <w:spacing w:line="300" w:lineRule="auto" w:after="100"/>
-        <w:ind w:left="259"/>
-      </w:pPr>
-      <w:r>
-        <w:rPr>
-          <w:rFonts w:ascii="Georgia" w:hAnsi="Georgia"/>
-          <w:color w:val="1C1C20"/>
-          <w:sz w:val="22"/>
-        </w:rPr>
-        <w:t>—¡POR LA GENERACIÓN DORADA! —rugió Ken alzando su puño envuelto en chispas.</w:t>
-      </w:r>
-    </w:p>
-    <w:p>
-      <w:pPr>
-        <w:spacing w:line="300" w:lineRule="auto" w:after="100"/>
-        <w:ind w:firstLine="403"/>
-      </w:pPr>
-      <w:r>
-        <w:rPr>
-          <w:rFonts w:ascii="Georgia" w:hAnsi="Georgia"/>
-          <w:color w:val="1C1C20"/>
-          <w:sz w:val="22"/>
-        </w:rPr>
-        <w:t>Los brindis y las risas se prolongaron hasta la madrugada bajo el cielo estrellado de Solaria. La misión de largo alcance había terminado, pero la leyenda de nuestra hermandad apenas comenzaba a escribirse.</w:t>
+        <w:t>El choque de jarras, los cantos y las risas se prolongaron hasta el filo de la madrugada bajo el cielo estrellado de Astraea. La gran prueba del despliegue había concluido, pero la leyenda de nuestra generación apenas comenzaba a dar sus primeros pasos.</w:t>
       </w:r>
     </w:p>
     <w:sectPr>

</xml_diff>